<commit_message>
Fix reference heading formatting in manuscript
</commit_message>
<xml_diff>
--- a/submission/results-in-physics-microarticle-draft.docx
+++ b/submission/results-in-physics-microarticle-draft.docx
@@ -2,7 +2,7 @@
 <file path=word/document.xml><?xml version="1.0" encoding="utf-8"?>
 <w:document xmlns:w="http://schemas.openxmlformats.org/wordprocessingml/2006/main" xmlns:m="http://schemas.openxmlformats.org/officeDocument/2006/math" xmlns:r="http://schemas.openxmlformats.org/officeDocument/2006/relationships" xmlns:o="urn:schemas-microsoft-com:office:office" xmlns:v="urn:schemas-microsoft-com:vml" xmlns:w10="urn:schemas-microsoft-com:office:word" xmlns:a="http://schemas.openxmlformats.org/drawingml/2006/main" xmlns:pic="http://schemas.openxmlformats.org/drawingml/2006/picture" xmlns:wp="http://schemas.openxmlformats.org/drawingml/2006/wordprocessingDrawing">
   <w:body>
-    <w:bookmarkStart w:id="16" w:name="X8b377f9762bac40b957f47aabb9c74ae01dc8ed"/>
+    <w:bookmarkStart w:id="17" w:name="X8b377f9762bac40b957f47aabb9c74ae01dc8ed"/>
     <w:p>
       <w:pPr>
         <w:pStyle w:val="Heading1"/>
@@ -729,8 +729,23 @@
       <w:r>
         <w:t xml:space="preserve">The simulation code, trained-recovery outputs, result tables, and generated figures are available in the public GitHub repository associated with this work.</w:t>
       </w:r>
-      <w:r>
-        <w:t xml:space="preserve">## References</w:t>
+    </w:p>
+    <w:bookmarkEnd w:id="15"/>
+    <w:bookmarkStart w:id="16" w:name="references"/>
+    <w:p>
+      <w:pPr>
+        <w:pStyle w:val="Heading2"/>
+      </w:pPr>
+      <w:r>
+        <w:t xml:space="preserve">References</w:t>
+      </w:r>
+    </w:p>
+    <w:p>
+      <w:pPr>
+        <w:pStyle w:val="FirstParagraph"/>
+      </w:pPr>
+      <w:r>
+        <w:t xml:space="preserve">[1] W. Ding, X. Zhang, J. Liu, and X. Wang, “Quantum dynamic response-based NV-diamond magnetometry: Robustness to decoherence and applications in motion detection of magnetic nanoparticles,” arXiv:2307.05255, 2023.</w:t>
       </w:r>
     </w:p>
     <w:p>
@@ -738,7 +753,7 @@
         <w:pStyle w:val="BodyText"/>
       </w:pPr>
       <w:r>
-        <w:t xml:space="preserve">[1] W. Ding, X. Zhang, J. Liu, and X. Wang, “Quantum dynamic response-based NV-diamond magnetometry: Robustness to decoherence and applications in motion detection of magnetic nanoparticles,” arXiv:2307.05255, 2023.</w:t>
+        <w:t xml:space="preserve">[2] J. Amoros-Binefa and J. Kolodynski, “Noisy atomic magnetometry with Kalman filtering and measurement-based feedback,” arXiv:2403.14764, 2024.</w:t>
       </w:r>
     </w:p>
     <w:p>
@@ -746,7 +761,7 @@
         <w:pStyle w:val="BodyText"/>
       </w:pPr>
       <w:r>
-        <w:t xml:space="preserve">[2] J. Amoros-Binefa and J. Kolodynski, “Noisy atomic magnetometry with Kalman filtering and measurement-based feedback,” arXiv:2403.14764, 2024.</w:t>
+        <w:t xml:space="preserve">[3] J. Tian, R. S. Said, F. Jelezko, J. Cai, and L. Xiao, “Bayesian-based hybrid method for rapid optimization of NV center sensors,” arXiv:2302.08410, 2023.</w:t>
       </w:r>
     </w:p>
     <w:p>
@@ -754,7 +769,7 @@
         <w:pStyle w:val="BodyText"/>
       </w:pPr>
       <w:r>
-        <w:t xml:space="preserve">[3] J. Tian, R. S. Said, F. Jelezko, J. Cai, and L. Xiao, “Bayesian-based hybrid method for rapid optimization of NV center sensors,” arXiv:2302.08410, 2023.</w:t>
+        <w:t xml:space="preserve">[4] F. Belliardo, F. Zoratti, and V. Giovannetti, “Applications of model-aware reinforcement learning in Bayesian quantum metrology,” arXiv:2403.05706, 2024.</w:t>
       </w:r>
     </w:p>
     <w:p>
@@ -762,7 +777,7 @@
         <w:pStyle w:val="BodyText"/>
       </w:pPr>
       <w:r>
-        <w:t xml:space="preserve">[4] F. Belliardo, F. Zoratti, and V. Giovannetti, “Applications of model-aware reinforcement learning in Bayesian quantum metrology,” arXiv:2403.05706, 2024.</w:t>
+        <w:t xml:space="preserve">[5] K.-H. Cheng, Z. Kazi, J. Rovny, B. Zhang, L. Nassar, J. D. Thompson, and N. P. de Leon, “Massively multiplexed nanoscale magnetometry with diamond quantum sensors,” arXiv:2408.11666, 2024.</w:t>
       </w:r>
     </w:p>
     <w:p>
@@ -770,7 +785,7 @@
         <w:pStyle w:val="BodyText"/>
       </w:pPr>
       <w:r>
-        <w:t xml:space="preserve">[5] K.-H. Cheng, Z. Kazi, J. Rovny, B. Zhang, L. Nassar, J. D. Thompson, and N. P. de Leon, “Massively multiplexed nanoscale magnetometry with diamond quantum sensors,” arXiv:2408.11666, 2024.</w:t>
+        <w:t xml:space="preserve">[6] A. Youssry, S. Todd, P. Murton, M. J. Arshad, A. Peruzzo, and C. Bonato, “Bayesian quantum sensing using graybox machine learning,” arXiv:2601.17465, 2026.</w:t>
       </w:r>
     </w:p>
     <w:p>
@@ -778,7 +793,7 @@
         <w:pStyle w:val="BodyText"/>
       </w:pPr>
       <w:r>
-        <w:t xml:space="preserve">[6] A. Youssry, S. Todd, P. Murton, M. J. Arshad, A. Peruzzo, and C. Bonato, “Bayesian quantum sensing using graybox machine learning,” arXiv:2601.17465, 2026.</w:t>
+        <w:t xml:space="preserve">[7] W. Zhou and Y. F. Xu, “Data-Guided Physics-Informed Neural Networks for Solving Inverse Problems in Partial Differential Equations,” arXiv:2407.10836, 2024.</w:t>
       </w:r>
     </w:p>
     <w:p>
@@ -786,22 +801,14 @@
         <w:pStyle w:val="BodyText"/>
       </w:pPr>
       <w:r>
-        <w:t xml:space="preserve">[7] W. Zhou and Y. F. Xu, “Data-Guided Physics-Informed Neural Networks for Solving Inverse Problems in Partial Differential Equations,” arXiv:2407.10836, 2024.</w:t>
-      </w:r>
-    </w:p>
-    <w:p>
-      <w:pPr>
-        <w:pStyle w:val="BodyText"/>
-      </w:pPr>
-      <w:r>
         <w:t xml:space="preserve">[8] E. W. Steele, D. R. Reising, and T. Li, “Recovery of Quantum Correlations using Machine Learning,” arXiv:2410.02818, 2024.</w:t>
       </w:r>
       <w:r>
         <w:t xml:space="preserve"> </w:t>
       </w:r>
     </w:p>
-    <w:bookmarkEnd w:id="15"/>
     <w:bookmarkEnd w:id="16"/>
+    <w:bookmarkEnd w:id="17"/>
     <w:sectPr>
       <w:footnotePr>
         <w:numRestart w:val="eachSect"/>

</xml_diff>

<commit_message>
Clean references to verified Results in Physics sources
</commit_message>
<xml_diff>
--- a/submission/results-in-physics-microarticle-draft.docx
+++ b/submission/results-in-physics-microarticle-draft.docx
@@ -745,7 +745,7 @@
         <w:pStyle w:val="FirstParagraph"/>
       </w:pPr>
       <w:r>
-        <w:t xml:space="preserve">[1] J. Jeon, Y. Kim, Y. Ito, N. Sugita, and M. Mitsuishi, “One-frame interferometric surface contouring via stepwise phase extraction and deep learning,” Results in Physics, Article 108560, 2025. doi:10.1016/j.rinp.2025.108560.</w:t>
+        <w:t xml:space="preserve">[1] J. Jeon, Y. Kim, Y. Ito, N. Sugita, and M. Mitsuishi, “One-frame interferometric surface contouring via stepwise phase extraction and deep learning,” Results in Physics, vol. 80, Article 108560, 2026. doi:10.1016/j.rinp.2025.108560.</w:t>
       </w:r>
     </w:p>
     <w:p>
@@ -753,7 +753,7 @@
         <w:pStyle w:val="BodyText"/>
       </w:pPr>
       <w:r>
-        <w:t xml:space="preserve">[2] G. Ramasekhar, M. Jawad, S. Jakeer, S. R. Reddisekhar Reddy, and S. Kamangar, “Machine learning approach for predicting heat and mass transfer in Maxwell–Sutterby fluid flow over a Riga plate geometry via Levenberg–Marquardt backpropagation neural network algorithm: Influence of joule heating and activation energy,” Results in Physics, Article 108528, 2025. doi:10.1016/j.rinp.2025.108528.</w:t>
+        <w:t xml:space="preserve">[2] G. Ramasekhar et al., “Machine learning approach for predicting heat and mass transfer in Maxwell–Sutterby fluid flow over a Riga plate geometry via Levenberg–Marquardt backpropagation neural network algorithm: Influence of Joule heating and activation energy,” Results in Physics, vol. 80, Article 108528, 2026. doi:10.1016/j.rinp.2025.108528.</w:t>
       </w:r>
     </w:p>
     <w:p>
@@ -761,15 +761,7 @@
         <w:pStyle w:val="BodyText"/>
       </w:pPr>
       <w:r>
-        <w:t xml:space="preserve">[3] B. Roumi and V. Fallahi, “Tunable dual-phase TMOKE sensor in a Weyl semimetal–plasmonic waveguide,” Results in Physics, Article 108571, 2025. doi:10.1016/j.rinp.2025.108571.</w:t>
-      </w:r>
-    </w:p>
-    <w:p>
-      <w:pPr>
-        <w:pStyle w:val="BodyText"/>
-      </w:pPr>
-      <w:r>
-        <w:t xml:space="preserve">[4] L. Guo, Y. Takashima, M. Kuriki, and M. Yamamoto, “Systematic optimization of Cs-Sb-O activated NEA GaAs photocathodes for long-lived accelerator electron sources,” Results in Physics, Article 108552, 2025. doi:10.1016/j.rinp.2025.108552.</w:t>
+        <w:t xml:space="preserve">[3] B. Roumi and V. Fallahi, “Tunable dual-phase TMOKE sensor in a Weyl semimetal–plasmonic waveguide,” Results in Physics, vol. 80, Article 108571, 2026. doi:10.1016/j.rinp.2025.108571.</w:t>
       </w:r>
     </w:p>
     <w:bookmarkEnd w:id="16"/>

</xml_diff>

<commit_message>
Verify and update references using allowed journals only
</commit_message>
<xml_diff>
--- a/submission/results-in-physics-microarticle-draft.docx
+++ b/submission/results-in-physics-microarticle-draft.docx
@@ -762,6 +762,46 @@
       </w:pPr>
       <w:r>
         <w:t xml:space="preserve">[3] B. Roumi and V. Fallahi, “Tunable dual-phase TMOKE sensor in a Weyl semimetal–plasmonic waveguide,” Results in Physics, vol. 80, Article 108571, 2026. doi:10.1016/j.rinp.2025.108571.</w:t>
+      </w:r>
+    </w:p>
+    <w:p>
+      <w:pPr>
+        <w:pStyle w:val="BodyText"/>
+      </w:pPr>
+      <w:r>
+        <w:t xml:space="preserve">[4] A. Hamann, P. Aigner, W. Dür, P. Sekatski, “Selective and noise-resilient wave estimation with quantum sensor networks,” Quantum Science and Technology, vol. 10, no. 3, Article 035028, 2025. doi:10.1088/2058-9565/add61b.</w:t>
+      </w:r>
+    </w:p>
+    <w:p>
+      <w:pPr>
+        <w:pStyle w:val="BodyText"/>
+      </w:pPr>
+      <w:r>
+        <w:t xml:space="preserve">[5] I. Jauch, T. Strohm, T. Fuchs, F. Jelezko, “Quantum magnetometry enhanced by machine learning,” Quantum Science and Technology, vol. 11, no. 1, Article 015055, 2026. doi:10.1088/2058-9565/ae3acf.</w:t>
+      </w:r>
+    </w:p>
+    <w:p>
+      <w:pPr>
+        <w:pStyle w:val="BodyText"/>
+      </w:pPr>
+      <w:r>
+        <w:t xml:space="preserve">[6] M. Mezzadri, L. Lepori, A. Chiesa, S. Carretta, “Dephasing-tolerant quantum sensing for transverse magnetic fields with spin qudits,” Quantum Science and Technology, vol. 10, no. 1, Article 015045, 2025. doi:10.1088/2058-9565/ad985e.</w:t>
+      </w:r>
+    </w:p>
+    <w:p>
+      <w:pPr>
+        <w:pStyle w:val="BodyText"/>
+      </w:pPr>
+      <w:r>
+        <w:t xml:space="preserve">[7] V. Cimini, E. Polino, M. Valeri, N. Spagnolo et al., “Benchmarking Bayesian quantum estimation,” Quantum Science and Technology, vol. 9, no. 3, Article 035035, 2024. doi:10.1088/2058-9565/ad48b3.</w:t>
+      </w:r>
+    </w:p>
+    <w:p>
+      <w:pPr>
+        <w:pStyle w:val="BodyText"/>
+      </w:pPr>
+      <w:r>
+        <w:t xml:space="preserve">[8] E. L. André, J. Bavaresco, M. Mehboudi, “Strategy optimization for Bayesian quantum parameter estimation with finite copies: Adaptive greedy, parallel, sequential, and general strategies,” Quantum Science and Technology, 2026. doi:10.1088/2058-9565/ae846c.</w:t>
       </w:r>
     </w:p>
     <w:bookmarkEnd w:id="16"/>

</xml_diff>